<commit_message>
Cheat sheet: plain black format to save ink
Co-Authored-By: Claude Opus 5.5 <noreply@anthropic.com>
Claude-Session: https://claude.ai/code/session_0166dwtN5G5mFvTnNQ48dqRe
</commit_message>
<xml_diff>
--- a/Chuleta_Brain_Aneurysms.docx
+++ b/Chuleta_Brain_Aneurysms.docx
@@ -10,7 +10,7 @@
         <w:rPr>
           <w:b/>
           <w:bCs/>
-          <w:color w:val="0D2E5C"/>
+          <w:color w:val="000000"/>
           <w:sz w:val="36"/>
           <w:szCs w:val="36"/>
         </w:rPr>
@@ -19,14 +19,11 @@
     </w:p>
     <w:p>
       <w:pPr>
-        <w:pBdr>
-          <w:bottom w:val="single" w:color="B5482A" w:sz="12" w:space="4"/>
-        </w:pBdr>
         <w:spacing w:after="160"/>
       </w:pPr>
       <w:r>
         <w:rPr>
-          <w:color w:val="6B7785"/>
+          <w:color w:val="000000"/>
           <w:sz w:val="18"/>
           <w:szCs w:val="18"/>
         </w:rPr>
@@ -36,7 +33,7 @@
         <w:rPr>
           <w:b/>
           <w:bCs/>
-          <w:color w:val="6B7785"/>
+          <w:color w:val="000000"/>
           <w:sz w:val="18"/>
           <w:szCs w:val="18"/>
         </w:rPr>
@@ -44,22 +41,22 @@
       </w:r>
       <w:r>
         <w:rPr>
-          <w:color w:val="6B7785"/>
+          <w:color w:val="000000"/>
           <w:sz w:val="18"/>
           <w:szCs w:val="18"/>
         </w:rPr>
-        <w:t xml:space="preserve"> = palabra clave. Debajo, en gris, qué significa.</w:t>
-      </w:r>
-    </w:p>
-    <w:p>
-      <w:pPr>
-        <w:spacing w:after="40"/>
-      </w:pPr>
-      <w:r>
-        <w:rPr>
-          <w:b/>
-          <w:bCs/>
-          <w:color w:val="0D2E5C"/>
+        <w:t xml:space="preserve"> = palabra clave. Debajo, en cursiva, qué significa.</w:t>
+      </w:r>
+    </w:p>
+    <w:p>
+      <w:pPr>
+        <w:spacing w:after="40"/>
+      </w:pPr>
+      <w:r>
+        <w:rPr>
+          <w:b/>
+          <w:bCs/>
+          <w:color w:val="000000"/>
           <w:sz w:val="18"/>
           <w:szCs w:val="18"/>
         </w:rPr>
@@ -67,7 +64,7 @@
       </w:r>
       <w:r>
         <w:rPr>
-          <w:color w:val="0D2E5C"/>
+          <w:color w:val="000000"/>
           <w:sz w:val="18"/>
           <w:szCs w:val="18"/>
         </w:rPr>
@@ -77,7 +74,7 @@
         <w:rPr>
           <w:b/>
           <w:bCs/>
-          <w:color w:val="0D2E5C"/>
+          <w:color w:val="000000"/>
           <w:sz w:val="18"/>
           <w:szCs w:val="18"/>
         </w:rPr>
@@ -85,7 +82,7 @@
       </w:r>
       <w:r>
         <w:rPr>
-          <w:color w:val="0D2E5C"/>
+          <w:color w:val="000000"/>
           <w:sz w:val="18"/>
           <w:szCs w:val="18"/>
         </w:rPr>
@@ -100,7 +97,7 @@
         <w:rPr>
           <w:b/>
           <w:bCs/>
-          <w:color w:val="0D2E5C"/>
+          <w:color w:val="000000"/>
           <w:sz w:val="18"/>
           <w:szCs w:val="18"/>
         </w:rPr>
@@ -108,7 +105,7 @@
       </w:r>
       <w:r>
         <w:rPr>
-          <w:color w:val="0D2E5C"/>
+          <w:color w:val="000000"/>
           <w:sz w:val="18"/>
           <w:szCs w:val="18"/>
         </w:rPr>
@@ -119,18 +116,16 @@
       <w:pPr>
         <w:keepNext/>
         <w:keepLines/>
-        <w:shd w:fill="0D2E5C" w:color="auto" w:val="clear"/>
         <w:spacing w:after="60" w:before="160"/>
       </w:pPr>
       <w:r>
         <w:rPr>
           <w:b/>
           <w:bCs/>
-          <w:color w:val="FFFFFF"/>
           <w:sz w:val="22"/>
           <w:szCs w:val="22"/>
         </w:rPr>
-        <w:t xml:space="preserve"> 1 · Cover</w:t>
+        <w:t xml:space="preserve">1 · Cover</w:t>
       </w:r>
     </w:p>
     <w:p>
@@ -155,7 +150,7 @@
         <w:rPr>
           <w:i/>
           <w:iCs/>
-          <w:color w:val="6B7785"/>
+          <w:color w:val="000000"/>
           <w:sz w:val="17"/>
           <w:szCs w:val="17"/>
         </w:rPr>
@@ -201,7 +196,7 @@
         <w:rPr>
           <w:i/>
           <w:iCs/>
-          <w:color w:val="6B7785"/>
+          <w:color w:val="000000"/>
           <w:sz w:val="17"/>
           <w:szCs w:val="17"/>
         </w:rPr>
@@ -263,7 +258,7 @@
         <w:rPr>
           <w:i/>
           <w:iCs/>
-          <w:color w:val="6B7785"/>
+          <w:color w:val="000000"/>
           <w:sz w:val="17"/>
           <w:szCs w:val="17"/>
         </w:rPr>
@@ -275,18 +270,16 @@
       <w:pPr>
         <w:keepNext/>
         <w:keepLines/>
-        <w:shd w:fill="0D2E5C" w:color="auto" w:val="clear"/>
         <w:spacing w:after="60" w:before="160"/>
       </w:pPr>
       <w:r>
         <w:rPr>
           <w:b/>
           <w:bCs/>
-          <w:color w:val="FFFFFF"/>
           <w:sz w:val="22"/>
           <w:szCs w:val="22"/>
         </w:rPr>
-        <w:t xml:space="preserve"> 2 · Index</w:t>
+        <w:t xml:space="preserve">2 · Index</w:t>
       </w:r>
     </w:p>
     <w:p>
@@ -327,7 +320,7 @@
         <w:rPr>
           <w:i/>
           <w:iCs/>
-          <w:color w:val="6B7785"/>
+          <w:color w:val="000000"/>
           <w:sz w:val="17"/>
           <w:szCs w:val="17"/>
         </w:rPr>
@@ -389,7 +382,7 @@
         <w:rPr>
           <w:i/>
           <w:iCs/>
-          <w:color w:val="6B7785"/>
+          <w:color w:val="000000"/>
           <w:sz w:val="17"/>
           <w:szCs w:val="17"/>
         </w:rPr>
@@ -435,7 +428,7 @@
         <w:rPr>
           <w:i/>
           <w:iCs/>
-          <w:color w:val="6B7785"/>
+          <w:color w:val="000000"/>
           <w:sz w:val="17"/>
           <w:szCs w:val="17"/>
         </w:rPr>
@@ -513,7 +506,7 @@
         <w:rPr>
           <w:i/>
           <w:iCs/>
-          <w:color w:val="6B7785"/>
+          <w:color w:val="000000"/>
           <w:sz w:val="17"/>
           <w:szCs w:val="17"/>
         </w:rPr>
@@ -525,22 +518,21 @@
       <w:pPr>
         <w:keepNext/>
         <w:keepLines/>
-        <w:shd w:fill="0D2E5C" w:color="auto" w:val="clear"/>
         <w:spacing w:after="60" w:before="160"/>
       </w:pPr>
       <w:r>
         <w:rPr>
           <w:b/>
           <w:bCs/>
-          <w:color w:val="FFFFFF"/>
           <w:sz w:val="22"/>
           <w:szCs w:val="22"/>
         </w:rPr>
-        <w:t xml:space="preserve"> 3 · A century of research</w:t>
-      </w:r>
-      <w:r>
-        <w:rPr>
-          <w:color w:val="D6E4F0"/>
+        <w:t xml:space="preserve">3 · A century of research</w:t>
+      </w:r>
+      <w:r>
+        <w:rPr>
+          <w:i/>
+          <w:iCs/>
           <w:sz w:val="18"/>
           <w:szCs w:val="18"/>
         </w:rPr>
@@ -594,7 +586,7 @@
         <w:rPr>
           <w:i/>
           <w:iCs/>
-          <w:color w:val="6B7785"/>
+          <w:color w:val="000000"/>
           <w:sz w:val="17"/>
           <w:szCs w:val="17"/>
         </w:rPr>
@@ -649,7 +641,7 @@
         <w:rPr>
           <w:i/>
           <w:iCs/>
-          <w:color w:val="6B7785"/>
+          <w:color w:val="000000"/>
           <w:sz w:val="17"/>
           <w:szCs w:val="17"/>
         </w:rPr>
@@ -704,7 +696,7 @@
         <w:rPr>
           <w:i/>
           <w:iCs/>
-          <w:color w:val="6B7785"/>
+          <w:color w:val="000000"/>
           <w:sz w:val="17"/>
           <w:szCs w:val="17"/>
         </w:rPr>
@@ -782,7 +774,7 @@
         <w:rPr>
           <w:i/>
           <w:iCs/>
-          <w:color w:val="6B7785"/>
+          <w:color w:val="000000"/>
           <w:sz w:val="17"/>
           <w:szCs w:val="17"/>
         </w:rPr>
@@ -837,7 +829,7 @@
         <w:rPr>
           <w:i/>
           <w:iCs/>
-          <w:color w:val="6B7785"/>
+          <w:color w:val="000000"/>
           <w:sz w:val="17"/>
           <w:szCs w:val="17"/>
         </w:rPr>
@@ -924,7 +916,7 @@
         <w:rPr>
           <w:i/>
           <w:iCs/>
-          <w:color w:val="6B7785"/>
+          <w:color w:val="000000"/>
           <w:sz w:val="17"/>
           <w:szCs w:val="17"/>
         </w:rPr>
@@ -942,7 +934,6 @@
         <w:rPr>
           <w:b/>
           <w:bCs/>
-          <w:color w:val="B5482A"/>
           <w:sz w:val="18"/>
           <w:szCs w:val="18"/>
         </w:rPr>
@@ -950,7 +941,7 @@
       </w:r>
       <w:r>
         <w:rPr>
-          <w:color w:val="B5482A"/>
+          <w:color w:val="000000"/>
           <w:sz w:val="18"/>
           <w:szCs w:val="18"/>
         </w:rPr>
@@ -961,18 +952,16 @@
       <w:pPr>
         <w:keepNext/>
         <w:keepLines/>
-        <w:shd w:fill="0D2E5C" w:color="auto" w:val="clear"/>
         <w:spacing w:after="60" w:before="160"/>
       </w:pPr>
       <w:r>
         <w:rPr>
           <w:b/>
           <w:bCs/>
-          <w:color w:val="FFFFFF"/>
           <w:sz w:val="22"/>
           <w:szCs w:val="22"/>
         </w:rPr>
-        <w:t xml:space="preserve"> 4 · A silent threat</w:t>
+        <w:t xml:space="preserve">4 · A silent threat</w:t>
       </w:r>
     </w:p>
     <w:p>
@@ -1006,7 +995,7 @@
         <w:rPr>
           <w:i/>
           <w:iCs/>
-          <w:color w:val="6B7785"/>
+          <w:color w:val="000000"/>
           <w:sz w:val="17"/>
           <w:szCs w:val="17"/>
         </w:rPr>
@@ -1068,7 +1057,7 @@
         <w:rPr>
           <w:i/>
           <w:iCs/>
-          <w:color w:val="6B7785"/>
+          <w:color w:val="000000"/>
           <w:sz w:val="17"/>
           <w:szCs w:val="17"/>
         </w:rPr>
@@ -1114,7 +1103,7 @@
         <w:rPr>
           <w:i/>
           <w:iCs/>
-          <w:color w:val="6B7785"/>
+          <w:color w:val="000000"/>
           <w:sz w:val="17"/>
           <w:szCs w:val="17"/>
         </w:rPr>
@@ -1185,7 +1174,7 @@
         <w:rPr>
           <w:i/>
           <w:iCs/>
-          <w:color w:val="6B7785"/>
+          <w:color w:val="000000"/>
           <w:sz w:val="17"/>
           <w:szCs w:val="17"/>
         </w:rPr>
@@ -1203,7 +1192,6 @@
         <w:rPr>
           <w:b/>
           <w:bCs/>
-          <w:color w:val="B5482A"/>
           <w:sz w:val="18"/>
           <w:szCs w:val="18"/>
         </w:rPr>
@@ -1211,7 +1199,7 @@
       </w:r>
       <w:r>
         <w:rPr>
-          <w:color w:val="B5482A"/>
+          <w:color w:val="000000"/>
           <w:sz w:val="18"/>
           <w:szCs w:val="18"/>
         </w:rPr>
@@ -1222,18 +1210,16 @@
       <w:pPr>
         <w:keepNext/>
         <w:keepLines/>
-        <w:shd w:fill="0D2E5C" w:color="auto" w:val="clear"/>
         <w:spacing w:after="60" w:before="160"/>
       </w:pPr>
       <w:r>
         <w:rPr>
           <w:b/>
           <w:bCs/>
-          <w:color w:val="FFFFFF"/>
           <w:sz w:val="22"/>
           <w:szCs w:val="22"/>
         </w:rPr>
-        <w:t xml:space="preserve"> 5 · Objective</w:t>
+        <w:t xml:space="preserve">5 · Objective</w:t>
       </w:r>
     </w:p>
     <w:p>
@@ -1290,7 +1276,7 @@
         <w:rPr>
           <w:i/>
           <w:iCs/>
-          <w:color w:val="6B7785"/>
+          <w:color w:val="000000"/>
           <w:sz w:val="17"/>
           <w:szCs w:val="17"/>
         </w:rPr>
@@ -1329,7 +1315,7 @@
         <w:rPr>
           <w:i/>
           <w:iCs/>
-          <w:color w:val="6B7785"/>
+          <w:color w:val="000000"/>
           <w:sz w:val="17"/>
           <w:szCs w:val="17"/>
         </w:rPr>
@@ -1384,7 +1370,7 @@
         <w:rPr>
           <w:i/>
           <w:iCs/>
-          <w:color w:val="6B7785"/>
+          <w:color w:val="000000"/>
           <w:sz w:val="17"/>
           <w:szCs w:val="17"/>
         </w:rPr>
@@ -1446,7 +1432,7 @@
         <w:rPr>
           <w:i/>
           <w:iCs/>
-          <w:color w:val="6B7785"/>
+          <w:color w:val="000000"/>
           <w:sz w:val="17"/>
           <w:szCs w:val="17"/>
         </w:rPr>
@@ -1464,7 +1450,6 @@
         <w:rPr>
           <w:b/>
           <w:bCs/>
-          <w:color w:val="B5482A"/>
           <w:sz w:val="18"/>
           <w:szCs w:val="18"/>
         </w:rPr>
@@ -1472,7 +1457,7 @@
       </w:r>
       <w:r>
         <w:rPr>
-          <w:color w:val="B5482A"/>
+          <w:color w:val="000000"/>
           <w:sz w:val="18"/>
           <w:szCs w:val="18"/>
         </w:rPr>
@@ -1483,18 +1468,16 @@
       <w:pPr>
         <w:keepNext/>
         <w:keepLines/>
-        <w:shd w:fill="0D2E5C" w:color="auto" w:val="clear"/>
         <w:spacing w:after="60" w:before="160"/>
       </w:pPr>
       <w:r>
         <w:rPr>
           <w:b/>
           <w:bCs/>
-          <w:color w:val="FFFFFF"/>
           <w:sz w:val="22"/>
           <w:szCs w:val="22"/>
         </w:rPr>
-        <w:t xml:space="preserve"> 6 · Definition</w:t>
+        <w:t xml:space="preserve">6 · Definition</w:t>
       </w:r>
     </w:p>
     <w:p>
@@ -1535,7 +1518,7 @@
         <w:rPr>
           <w:i/>
           <w:iCs/>
-          <w:color w:val="6B7785"/>
+          <w:color w:val="000000"/>
           <w:sz w:val="17"/>
           <w:szCs w:val="17"/>
         </w:rPr>
@@ -1597,7 +1580,7 @@
         <w:rPr>
           <w:i/>
           <w:iCs/>
-          <w:color w:val="6B7785"/>
+          <w:color w:val="000000"/>
           <w:sz w:val="17"/>
           <w:szCs w:val="17"/>
         </w:rPr>
@@ -1643,7 +1626,7 @@
         <w:rPr>
           <w:i/>
           <w:iCs/>
-          <w:color w:val="6B7785"/>
+          <w:color w:val="000000"/>
           <w:sz w:val="17"/>
           <w:szCs w:val="17"/>
         </w:rPr>
@@ -1721,7 +1704,7 @@
         <w:rPr>
           <w:i/>
           <w:iCs/>
-          <w:color w:val="6B7785"/>
+          <w:color w:val="000000"/>
           <w:sz w:val="17"/>
           <w:szCs w:val="17"/>
         </w:rPr>
@@ -1799,7 +1782,7 @@
         <w:rPr>
           <w:i/>
           <w:iCs/>
-          <w:color w:val="6B7785"/>
+          <w:color w:val="000000"/>
           <w:sz w:val="17"/>
           <w:szCs w:val="17"/>
         </w:rPr>
@@ -1817,7 +1800,6 @@
         <w:rPr>
           <w:b/>
           <w:bCs/>
-          <w:color w:val="B5482A"/>
           <w:sz w:val="18"/>
           <w:szCs w:val="18"/>
         </w:rPr>
@@ -1825,7 +1807,7 @@
       </w:r>
       <w:r>
         <w:rPr>
-          <w:color w:val="B5482A"/>
+          <w:color w:val="000000"/>
           <w:sz w:val="18"/>
           <w:szCs w:val="18"/>
         </w:rPr>
@@ -1836,18 +1818,16 @@
       <w:pPr>
         <w:keepNext/>
         <w:keepLines/>
-        <w:shd w:fill="0D2E5C" w:color="auto" w:val="clear"/>
         <w:spacing w:after="60" w:before="160"/>
       </w:pPr>
       <w:r>
         <w:rPr>
           <w:b/>
           <w:bCs/>
-          <w:color w:val="FFFFFF"/>
           <w:sz w:val="22"/>
           <w:szCs w:val="22"/>
         </w:rPr>
-        <w:t xml:space="preserve"> 7 · Types: shape and size</w:t>
+        <w:t xml:space="preserve">7 · Types: shape and size</w:t>
       </w:r>
     </w:p>
     <w:p>
@@ -1913,7 +1893,7 @@
         <w:rPr>
           <w:i/>
           <w:iCs/>
-          <w:color w:val="6B7785"/>
+          <w:color w:val="000000"/>
           <w:sz w:val="17"/>
           <w:szCs w:val="17"/>
         </w:rPr>
@@ -1968,7 +1948,7 @@
         <w:rPr>
           <w:i/>
           <w:iCs/>
-          <w:color w:val="6B7785"/>
+          <w:color w:val="000000"/>
           <w:sz w:val="17"/>
           <w:szCs w:val="17"/>
         </w:rPr>
@@ -2023,7 +2003,7 @@
         <w:rPr>
           <w:i/>
           <w:iCs/>
-          <w:color w:val="6B7785"/>
+          <w:color w:val="000000"/>
           <w:sz w:val="17"/>
           <w:szCs w:val="17"/>
         </w:rPr>
@@ -2069,7 +2049,7 @@
         <w:rPr>
           <w:i/>
           <w:iCs/>
-          <w:color w:val="6B7785"/>
+          <w:color w:val="000000"/>
           <w:sz w:val="17"/>
           <w:szCs w:val="17"/>
         </w:rPr>
@@ -2163,7 +2143,7 @@
         <w:rPr>
           <w:i/>
           <w:iCs/>
-          <w:color w:val="6B7785"/>
+          <w:color w:val="000000"/>
           <w:sz w:val="17"/>
           <w:szCs w:val="17"/>
         </w:rPr>
@@ -2209,7 +2189,7 @@
         <w:rPr>
           <w:i/>
           <w:iCs/>
-          <w:color w:val="6B7785"/>
+          <w:color w:val="000000"/>
           <w:sz w:val="17"/>
           <w:szCs w:val="17"/>
         </w:rPr>
@@ -2227,7 +2207,6 @@
         <w:rPr>
           <w:b/>
           <w:bCs/>
-          <w:color w:val="B5482A"/>
           <w:sz w:val="18"/>
           <w:szCs w:val="18"/>
         </w:rPr>
@@ -2235,7 +2214,7 @@
       </w:r>
       <w:r>
         <w:rPr>
-          <w:color w:val="B5482A"/>
+          <w:color w:val="000000"/>
           <w:sz w:val="18"/>
           <w:szCs w:val="18"/>
         </w:rPr>
@@ -2246,18 +2225,16 @@
       <w:pPr>
         <w:keepNext/>
         <w:keepLines/>
-        <w:shd w:fill="0D2E5C" w:color="auto" w:val="clear"/>
         <w:spacing w:after="60" w:before="160"/>
       </w:pPr>
       <w:r>
         <w:rPr>
           <w:b/>
           <w:bCs/>
-          <w:color w:val="FFFFFF"/>
           <w:sz w:val="22"/>
           <w:szCs w:val="22"/>
         </w:rPr>
-        <w:t xml:space="preserve"> 8 · How severe is the bleed?</w:t>
+        <w:t xml:space="preserve">8 · How severe is the bleed?</w:t>
       </w:r>
     </w:p>
     <w:p>
@@ -2298,7 +2275,7 @@
         <w:rPr>
           <w:i/>
           <w:iCs/>
-          <w:color w:val="6B7785"/>
+          <w:color w:val="000000"/>
           <w:sz w:val="17"/>
           <w:szCs w:val="17"/>
         </w:rPr>
@@ -2344,7 +2321,7 @@
         <w:rPr>
           <w:i/>
           <w:iCs/>
-          <w:color w:val="6B7785"/>
+          <w:color w:val="000000"/>
           <w:sz w:val="17"/>
           <w:szCs w:val="17"/>
         </w:rPr>
@@ -2406,7 +2383,7 @@
         <w:rPr>
           <w:i/>
           <w:iCs/>
-          <w:color w:val="6B7785"/>
+          <w:color w:val="000000"/>
           <w:sz w:val="17"/>
           <w:szCs w:val="17"/>
         </w:rPr>
@@ -2468,7 +2445,7 @@
         <w:rPr>
           <w:i/>
           <w:iCs/>
-          <w:color w:val="6B7785"/>
+          <w:color w:val="000000"/>
           <w:sz w:val="17"/>
           <w:szCs w:val="17"/>
         </w:rPr>
@@ -2523,7 +2500,7 @@
         <w:rPr>
           <w:i/>
           <w:iCs/>
-          <w:color w:val="6B7785"/>
+          <w:color w:val="000000"/>
           <w:sz w:val="17"/>
           <w:szCs w:val="17"/>
         </w:rPr>
@@ -2541,7 +2518,6 @@
         <w:rPr>
           <w:b/>
           <w:bCs/>
-          <w:color w:val="B5482A"/>
           <w:sz w:val="18"/>
           <w:szCs w:val="18"/>
         </w:rPr>
@@ -2549,7 +2525,7 @@
       </w:r>
       <w:r>
         <w:rPr>
-          <w:color w:val="B5482A"/>
+          <w:color w:val="000000"/>
           <w:sz w:val="18"/>
           <w:szCs w:val="18"/>
         </w:rPr>
@@ -2560,18 +2536,16 @@
       <w:pPr>
         <w:keepNext/>
         <w:keepLines/>
-        <w:shd w:fill="0D2E5C" w:color="auto" w:val="clear"/>
         <w:spacing w:after="60" w:before="160"/>
       </w:pPr>
       <w:r>
         <w:rPr>
           <w:b/>
           <w:bCs/>
-          <w:color w:val="FFFFFF"/>
           <w:sz w:val="22"/>
           <w:szCs w:val="22"/>
         </w:rPr>
-        <w:t xml:space="preserve"> 9 · Causes &amp; risk factors</w:t>
+        <w:t xml:space="preserve">9 · Causes &amp; risk factors</w:t>
       </w:r>
     </w:p>
     <w:p>
@@ -2612,7 +2586,7 @@
         <w:rPr>
           <w:i/>
           <w:iCs/>
-          <w:color w:val="6B7785"/>
+          <w:color w:val="000000"/>
           <w:sz w:val="17"/>
           <w:szCs w:val="17"/>
         </w:rPr>
@@ -2683,7 +2657,7 @@
         <w:rPr>
           <w:i/>
           <w:iCs/>
-          <w:color w:val="6B7785"/>
+          <w:color w:val="000000"/>
           <w:sz w:val="17"/>
           <w:szCs w:val="17"/>
         </w:rPr>
@@ -2738,7 +2712,7 @@
         <w:rPr>
           <w:i/>
           <w:iCs/>
-          <w:color w:val="6B7785"/>
+          <w:color w:val="000000"/>
           <w:sz w:val="17"/>
           <w:szCs w:val="17"/>
         </w:rPr>
@@ -2793,7 +2767,7 @@
         <w:rPr>
           <w:i/>
           <w:iCs/>
-          <w:color w:val="6B7785"/>
+          <w:color w:val="000000"/>
           <w:sz w:val="17"/>
           <w:szCs w:val="17"/>
         </w:rPr>
@@ -2811,7 +2785,6 @@
         <w:rPr>
           <w:b/>
           <w:bCs/>
-          <w:color w:val="B5482A"/>
           <w:sz w:val="18"/>
           <w:szCs w:val="18"/>
         </w:rPr>
@@ -2819,7 +2792,7 @@
       </w:r>
       <w:r>
         <w:rPr>
-          <w:color w:val="B5482A"/>
+          <w:color w:val="000000"/>
           <w:sz w:val="18"/>
           <w:szCs w:val="18"/>
         </w:rPr>
@@ -2830,18 +2803,16 @@
       <w:pPr>
         <w:keepNext/>
         <w:keepLines/>
-        <w:shd w:fill="0D2E5C" w:color="auto" w:val="clear"/>
         <w:spacing w:after="60" w:before="160"/>
       </w:pPr>
       <w:r>
         <w:rPr>
           <w:b/>
           <w:bCs/>
-          <w:color w:val="FFFFFF"/>
           <w:sz w:val="22"/>
           <w:szCs w:val="22"/>
         </w:rPr>
-        <w:t xml:space="preserve"> 10 · Signs &amp; symptoms</w:t>
+        <w:t xml:space="preserve">10 · Signs &amp; symptoms</w:t>
       </w:r>
     </w:p>
     <w:p>
@@ -2882,7 +2853,7 @@
         <w:rPr>
           <w:i/>
           <w:iCs/>
-          <w:color w:val="6B7785"/>
+          <w:color w:val="000000"/>
           <w:sz w:val="17"/>
           <w:szCs w:val="17"/>
         </w:rPr>
@@ -2960,7 +2931,7 @@
         <w:rPr>
           <w:i/>
           <w:iCs/>
-          <w:color w:val="6B7785"/>
+          <w:color w:val="000000"/>
           <w:sz w:val="17"/>
           <w:szCs w:val="17"/>
         </w:rPr>
@@ -3015,7 +2986,7 @@
         <w:rPr>
           <w:i/>
           <w:iCs/>
-          <w:color w:val="6B7785"/>
+          <w:color w:val="000000"/>
           <w:sz w:val="17"/>
           <w:szCs w:val="17"/>
         </w:rPr>
@@ -3118,7 +3089,7 @@
         <w:rPr>
           <w:i/>
           <w:iCs/>
-          <w:color w:val="6B7785"/>
+          <w:color w:val="000000"/>
           <w:sz w:val="17"/>
           <w:szCs w:val="17"/>
         </w:rPr>
@@ -3173,7 +3144,7 @@
         <w:rPr>
           <w:i/>
           <w:iCs/>
-          <w:color w:val="6B7785"/>
+          <w:color w:val="000000"/>
           <w:sz w:val="17"/>
           <w:szCs w:val="17"/>
         </w:rPr>
@@ -3191,7 +3162,6 @@
         <w:rPr>
           <w:b/>
           <w:bCs/>
-          <w:color w:val="B5482A"/>
           <w:sz w:val="18"/>
           <w:szCs w:val="18"/>
         </w:rPr>
@@ -3199,7 +3169,7 @@
       </w:r>
       <w:r>
         <w:rPr>
-          <w:color w:val="B5482A"/>
+          <w:color w:val="000000"/>
           <w:sz w:val="18"/>
           <w:szCs w:val="18"/>
         </w:rPr>
@@ -3210,18 +3180,16 @@
       <w:pPr>
         <w:keepNext/>
         <w:keepLines/>
-        <w:shd w:fill="0D2E5C" w:color="auto" w:val="clear"/>
         <w:spacing w:after="60" w:before="160"/>
       </w:pPr>
       <w:r>
         <w:rPr>
           <w:b/>
           <w:bCs/>
-          <w:color w:val="FFFFFF"/>
           <w:sz w:val="22"/>
           <w:szCs w:val="22"/>
         </w:rPr>
-        <w:t xml:space="preserve"> 11 · Diagnosis</w:t>
+        <w:t xml:space="preserve">11 · Diagnosis</w:t>
       </w:r>
     </w:p>
     <w:p>
@@ -3294,7 +3262,7 @@
         <w:rPr>
           <w:i/>
           <w:iCs/>
-          <w:color w:val="6B7785"/>
+          <w:color w:val="000000"/>
           <w:sz w:val="17"/>
           <w:szCs w:val="17"/>
         </w:rPr>
@@ -3365,7 +3333,7 @@
         <w:rPr>
           <w:i/>
           <w:iCs/>
-          <w:color w:val="6B7785"/>
+          <w:color w:val="000000"/>
           <w:sz w:val="17"/>
           <w:szCs w:val="17"/>
         </w:rPr>
@@ -3427,7 +3395,7 @@
         <w:rPr>
           <w:i/>
           <w:iCs/>
-          <w:color w:val="6B7785"/>
+          <w:color w:val="000000"/>
           <w:sz w:val="17"/>
           <w:szCs w:val="17"/>
         </w:rPr>
@@ -3482,7 +3450,7 @@
         <w:rPr>
           <w:i/>
           <w:iCs/>
-          <w:color w:val="6B7785"/>
+          <w:color w:val="000000"/>
           <w:sz w:val="17"/>
           <w:szCs w:val="17"/>
         </w:rPr>
@@ -3553,7 +3521,7 @@
         <w:rPr>
           <w:i/>
           <w:iCs/>
-          <w:color w:val="6B7785"/>
+          <w:color w:val="000000"/>
           <w:sz w:val="17"/>
           <w:szCs w:val="17"/>
         </w:rPr>
@@ -3571,7 +3539,6 @@
         <w:rPr>
           <w:b/>
           <w:bCs/>
-          <w:color w:val="B5482A"/>
           <w:sz w:val="18"/>
           <w:szCs w:val="18"/>
         </w:rPr>
@@ -3579,7 +3546,7 @@
       </w:r>
       <w:r>
         <w:rPr>
-          <w:color w:val="B5482A"/>
+          <w:color w:val="000000"/>
           <w:sz w:val="18"/>
           <w:szCs w:val="18"/>
         </w:rPr>
@@ -3590,18 +3557,16 @@
       <w:pPr>
         <w:keepNext/>
         <w:keepLines/>
-        <w:shd w:fill="0D2E5C" w:color="auto" w:val="clear"/>
         <w:spacing w:after="60" w:before="160"/>
       </w:pPr>
       <w:r>
         <w:rPr>
           <w:b/>
           <w:bCs/>
-          <w:color w:val="FFFFFF"/>
           <w:sz w:val="22"/>
           <w:szCs w:val="22"/>
         </w:rPr>
-        <w:t xml:space="preserve"> 12 · Prevention</w:t>
+        <w:t xml:space="preserve">12 · Prevention</w:t>
       </w:r>
     </w:p>
     <w:p>
@@ -3658,7 +3623,7 @@
         <w:rPr>
           <w:i/>
           <w:iCs/>
-          <w:color w:val="6B7785"/>
+          <w:color w:val="000000"/>
           <w:sz w:val="17"/>
           <w:szCs w:val="17"/>
         </w:rPr>
@@ -3713,7 +3678,7 @@
         <w:rPr>
           <w:i/>
           <w:iCs/>
-          <w:color w:val="6B7785"/>
+          <w:color w:val="000000"/>
           <w:sz w:val="17"/>
           <w:szCs w:val="17"/>
         </w:rPr>
@@ -3775,7 +3740,7 @@
         <w:rPr>
           <w:i/>
           <w:iCs/>
-          <w:color w:val="6B7785"/>
+          <w:color w:val="000000"/>
           <w:sz w:val="17"/>
           <w:szCs w:val="17"/>
         </w:rPr>
@@ -3830,7 +3795,7 @@
         <w:rPr>
           <w:i/>
           <w:iCs/>
-          <w:color w:val="6B7785"/>
+          <w:color w:val="000000"/>
           <w:sz w:val="17"/>
           <w:szCs w:val="17"/>
         </w:rPr>
@@ -3848,7 +3813,6 @@
         <w:rPr>
           <w:b/>
           <w:bCs/>
-          <w:color w:val="B5482A"/>
           <w:sz w:val="18"/>
           <w:szCs w:val="18"/>
         </w:rPr>
@@ -3856,7 +3820,7 @@
       </w:r>
       <w:r>
         <w:rPr>
-          <w:color w:val="B5482A"/>
+          <w:color w:val="000000"/>
           <w:sz w:val="18"/>
           <w:szCs w:val="18"/>
         </w:rPr>
@@ -3867,18 +3831,16 @@
       <w:pPr>
         <w:keepNext/>
         <w:keepLines/>
-        <w:shd w:fill="0D2E5C" w:color="auto" w:val="clear"/>
         <w:spacing w:after="60" w:before="160"/>
       </w:pPr>
       <w:r>
         <w:rPr>
           <w:b/>
           <w:bCs/>
-          <w:color w:val="FFFFFF"/>
           <w:sz w:val="22"/>
           <w:szCs w:val="22"/>
         </w:rPr>
-        <w:t xml:space="preserve"> 13 · Treatment · unruptured: watch or treat?</w:t>
+        <w:t xml:space="preserve">13 · Treatment · unruptured: watch or treat?</w:t>
       </w:r>
     </w:p>
     <w:p>
@@ -3912,7 +3874,7 @@
         <w:rPr>
           <w:i/>
           <w:iCs/>
-          <w:color w:val="6B7785"/>
+          <w:color w:val="000000"/>
           <w:sz w:val="17"/>
           <w:szCs w:val="17"/>
         </w:rPr>
@@ -3958,7 +3920,7 @@
         <w:rPr>
           <w:i/>
           <w:iCs/>
-          <w:color w:val="6B7785"/>
+          <w:color w:val="000000"/>
           <w:sz w:val="17"/>
           <w:szCs w:val="17"/>
         </w:rPr>
@@ -4020,7 +3982,7 @@
         <w:rPr>
           <w:i/>
           <w:iCs/>
-          <w:color w:val="6B7785"/>
+          <w:color w:val="000000"/>
           <w:sz w:val="17"/>
           <w:szCs w:val="17"/>
         </w:rPr>
@@ -4098,7 +4060,7 @@
         <w:rPr>
           <w:i/>
           <w:iCs/>
-          <w:color w:val="6B7785"/>
+          <w:color w:val="000000"/>
           <w:sz w:val="17"/>
           <w:szCs w:val="17"/>
         </w:rPr>
@@ -4137,7 +4099,7 @@
         <w:rPr>
           <w:i/>
           <w:iCs/>
-          <w:color w:val="6B7785"/>
+          <w:color w:val="000000"/>
           <w:sz w:val="17"/>
           <w:szCs w:val="17"/>
         </w:rPr>
@@ -4155,7 +4117,6 @@
         <w:rPr>
           <w:b/>
           <w:bCs/>
-          <w:color w:val="B5482A"/>
           <w:sz w:val="18"/>
           <w:szCs w:val="18"/>
         </w:rPr>
@@ -4163,7 +4124,7 @@
       </w:r>
       <w:r>
         <w:rPr>
-          <w:color w:val="B5482A"/>
+          <w:color w:val="000000"/>
           <w:sz w:val="18"/>
           <w:szCs w:val="18"/>
         </w:rPr>
@@ -4174,22 +4135,21 @@
       <w:pPr>
         <w:keepNext/>
         <w:keepLines/>
-        <w:shd w:fill="0D2E5C" w:color="auto" w:val="clear"/>
         <w:spacing w:after="60" w:before="160"/>
       </w:pPr>
       <w:r>
         <w:rPr>
           <w:b/>
           <w:bCs/>
-          <w:color w:val="FFFFFF"/>
           <w:sz w:val="22"/>
           <w:szCs w:val="22"/>
         </w:rPr>
-        <w:t xml:space="preserve"> 14 · Video · coiling</w:t>
-      </w:r>
-      <w:r>
-        <w:rPr>
-          <w:color w:val="D6E4F0"/>
+        <w:t xml:space="preserve">14 · Video · coiling</w:t>
+      </w:r>
+      <w:r>
+        <w:rPr>
+          <w:i/>
+          <w:iCs/>
           <w:sz w:val="18"/>
           <w:szCs w:val="18"/>
         </w:rPr>
@@ -4250,7 +4210,7 @@
         <w:rPr>
           <w:i/>
           <w:iCs/>
-          <w:color w:val="6B7785"/>
+          <w:color w:val="000000"/>
           <w:sz w:val="17"/>
           <w:szCs w:val="17"/>
         </w:rPr>
@@ -4282,7 +4242,7 @@
         <w:rPr>
           <w:i/>
           <w:iCs/>
-          <w:color w:val="6B7785"/>
+          <w:color w:val="000000"/>
           <w:sz w:val="17"/>
           <w:szCs w:val="17"/>
         </w:rPr>
@@ -4344,7 +4304,7 @@
         <w:rPr>
           <w:i/>
           <w:iCs/>
-          <w:color w:val="6B7785"/>
+          <w:color w:val="000000"/>
           <w:sz w:val="17"/>
           <w:szCs w:val="17"/>
         </w:rPr>
@@ -4399,7 +4359,7 @@
         <w:rPr>
           <w:i/>
           <w:iCs/>
-          <w:color w:val="6B7785"/>
+          <w:color w:val="000000"/>
           <w:sz w:val="17"/>
           <w:szCs w:val="17"/>
         </w:rPr>
@@ -4417,7 +4377,6 @@
         <w:rPr>
           <w:b/>
           <w:bCs/>
-          <w:color w:val="B5482A"/>
           <w:sz w:val="18"/>
           <w:szCs w:val="18"/>
         </w:rPr>
@@ -4425,7 +4384,7 @@
       </w:r>
       <w:r>
         <w:rPr>
-          <w:color w:val="B5482A"/>
+          <w:color w:val="000000"/>
           <w:sz w:val="18"/>
           <w:szCs w:val="18"/>
         </w:rPr>
@@ -4436,18 +4395,16 @@
       <w:pPr>
         <w:keepNext/>
         <w:keepLines/>
-        <w:shd w:fill="0D2E5C" w:color="auto" w:val="clear"/>
         <w:spacing w:after="60" w:before="160"/>
       </w:pPr>
       <w:r>
         <w:rPr>
           <w:b/>
           <w:bCs/>
-          <w:color w:val="FFFFFF"/>
           <w:sz w:val="22"/>
           <w:szCs w:val="22"/>
         </w:rPr>
-        <w:t xml:space="preserve"> 15 · Treatment · ruptured: emergency</w:t>
+        <w:t xml:space="preserve">15 · Treatment · ruptured: emergency</w:t>
       </w:r>
     </w:p>
     <w:p>
@@ -4488,7 +4445,7 @@
         <w:rPr>
           <w:i/>
           <w:iCs/>
-          <w:color w:val="6B7785"/>
+          <w:color w:val="000000"/>
           <w:sz w:val="17"/>
           <w:szCs w:val="17"/>
         </w:rPr>
@@ -4543,7 +4500,7 @@
         <w:rPr>
           <w:i/>
           <w:iCs/>
-          <w:color w:val="6B7785"/>
+          <w:color w:val="000000"/>
           <w:sz w:val="17"/>
           <w:szCs w:val="17"/>
         </w:rPr>
@@ -4598,7 +4555,7 @@
         <w:rPr>
           <w:i/>
           <w:iCs/>
-          <w:color w:val="6B7785"/>
+          <w:color w:val="000000"/>
           <w:sz w:val="17"/>
           <w:szCs w:val="17"/>
         </w:rPr>
@@ -4669,7 +4626,7 @@
         <w:rPr>
           <w:i/>
           <w:iCs/>
-          <w:color w:val="6B7785"/>
+          <w:color w:val="000000"/>
           <w:sz w:val="17"/>
           <w:szCs w:val="17"/>
         </w:rPr>
@@ -4715,7 +4672,7 @@
         <w:rPr>
           <w:i/>
           <w:iCs/>
-          <w:color w:val="6B7785"/>
+          <w:color w:val="000000"/>
           <w:sz w:val="17"/>
           <w:szCs w:val="17"/>
         </w:rPr>
@@ -4733,7 +4690,6 @@
         <w:rPr>
           <w:b/>
           <w:bCs/>
-          <w:color w:val="B5482A"/>
           <w:sz w:val="18"/>
           <w:szCs w:val="18"/>
         </w:rPr>
@@ -4741,7 +4697,7 @@
       </w:r>
       <w:r>
         <w:rPr>
-          <w:color w:val="B5482A"/>
+          <w:color w:val="000000"/>
           <w:sz w:val="18"/>
           <w:szCs w:val="18"/>
         </w:rPr>
@@ -4752,18 +4708,16 @@
       <w:pPr>
         <w:keepNext/>
         <w:keepLines/>
-        <w:shd w:fill="0D2E5C" w:color="auto" w:val="clear"/>
         <w:spacing w:after="60" w:before="160"/>
       </w:pPr>
       <w:r>
         <w:rPr>
           <w:b/>
           <w:bCs/>
-          <w:color w:val="FFFFFF"/>
           <w:sz w:val="22"/>
           <w:szCs w:val="22"/>
         </w:rPr>
-        <w:t xml:space="preserve"> 16 · Statistics · unruptured</w:t>
+        <w:t xml:space="preserve">16 · Statistics · unruptured</w:t>
       </w:r>
     </w:p>
     <w:p>
@@ -4829,7 +4783,7 @@
         <w:rPr>
           <w:i/>
           <w:iCs/>
-          <w:color w:val="6B7785"/>
+          <w:color w:val="000000"/>
           <w:sz w:val="17"/>
           <w:szCs w:val="17"/>
         </w:rPr>
@@ -4884,7 +4838,7 @@
         <w:rPr>
           <w:i/>
           <w:iCs/>
-          <w:color w:val="6B7785"/>
+          <w:color w:val="000000"/>
           <w:sz w:val="17"/>
           <w:szCs w:val="17"/>
         </w:rPr>
@@ -4939,7 +4893,7 @@
         <w:rPr>
           <w:i/>
           <w:iCs/>
-          <w:color w:val="6B7785"/>
+          <w:color w:val="000000"/>
           <w:sz w:val="17"/>
           <w:szCs w:val="17"/>
         </w:rPr>
@@ -4978,7 +4932,7 @@
         <w:rPr>
           <w:i/>
           <w:iCs/>
-          <w:color w:val="6B7785"/>
+          <w:color w:val="000000"/>
           <w:sz w:val="17"/>
           <w:szCs w:val="17"/>
         </w:rPr>
@@ -5033,7 +4987,7 @@
         <w:rPr>
           <w:i/>
           <w:iCs/>
-          <w:color w:val="6B7785"/>
+          <w:color w:val="000000"/>
           <w:sz w:val="17"/>
           <w:szCs w:val="17"/>
         </w:rPr>
@@ -5051,7 +5005,6 @@
         <w:rPr>
           <w:b/>
           <w:bCs/>
-          <w:color w:val="B5482A"/>
           <w:sz w:val="18"/>
           <w:szCs w:val="18"/>
         </w:rPr>
@@ -5059,7 +5012,7 @@
       </w:r>
       <w:r>
         <w:rPr>
-          <w:color w:val="B5482A"/>
+          <w:color w:val="000000"/>
           <w:sz w:val="18"/>
           <w:szCs w:val="18"/>
         </w:rPr>
@@ -5070,18 +5023,16 @@
       <w:pPr>
         <w:keepNext/>
         <w:keepLines/>
-        <w:shd w:fill="0D2E5C" w:color="auto" w:val="clear"/>
         <w:spacing w:after="60" w:before="160"/>
       </w:pPr>
       <w:r>
         <w:rPr>
           <w:b/>
           <w:bCs/>
-          <w:color w:val="FFFFFF"/>
           <w:sz w:val="22"/>
           <w:szCs w:val="22"/>
         </w:rPr>
-        <w:t xml:space="preserve"> 17 · Incidence by region</w:t>
+        <w:t xml:space="preserve">17 · Incidence by region</w:t>
       </w:r>
     </w:p>
     <w:p>
@@ -5122,7 +5073,7 @@
         <w:rPr>
           <w:i/>
           <w:iCs/>
-          <w:color w:val="6B7785"/>
+          <w:color w:val="000000"/>
           <w:sz w:val="17"/>
           <w:szCs w:val="17"/>
         </w:rPr>
@@ -5168,7 +5119,7 @@
         <w:rPr>
           <w:i/>
           <w:iCs/>
-          <w:color w:val="6B7785"/>
+          <w:color w:val="000000"/>
           <w:sz w:val="17"/>
           <w:szCs w:val="17"/>
         </w:rPr>
@@ -5239,7 +5190,7 @@
         <w:rPr>
           <w:i/>
           <w:iCs/>
-          <w:color w:val="6B7785"/>
+          <w:color w:val="000000"/>
           <w:sz w:val="17"/>
           <w:szCs w:val="17"/>
         </w:rPr>
@@ -5301,7 +5252,7 @@
         <w:rPr>
           <w:i/>
           <w:iCs/>
-          <w:color w:val="6B7785"/>
+          <w:color w:val="000000"/>
           <w:sz w:val="17"/>
           <w:szCs w:val="17"/>
         </w:rPr>
@@ -5319,7 +5270,6 @@
         <w:rPr>
           <w:b/>
           <w:bCs/>
-          <w:color w:val="B5482A"/>
           <w:sz w:val="18"/>
           <w:szCs w:val="18"/>
         </w:rPr>
@@ -5327,7 +5277,7 @@
       </w:r>
       <w:r>
         <w:rPr>
-          <w:color w:val="B5482A"/>
+          <w:color w:val="000000"/>
           <w:sz w:val="18"/>
           <w:szCs w:val="18"/>
         </w:rPr>
@@ -5338,18 +5288,16 @@
       <w:pPr>
         <w:keepNext/>
         <w:keepLines/>
-        <w:shd w:fill="0D2E5C" w:color="auto" w:val="clear"/>
         <w:spacing w:after="60" w:before="160"/>
       </w:pPr>
       <w:r>
         <w:rPr>
           <w:b/>
           <w:bCs/>
-          <w:color w:val="FFFFFF"/>
           <w:sz w:val="22"/>
           <w:szCs w:val="22"/>
         </w:rPr>
-        <w:t xml:space="preserve"> 18 · Time, sex, age and outcome</w:t>
+        <w:t xml:space="preserve">18 · Time, sex, age and outcome</w:t>
       </w:r>
     </w:p>
     <w:p>
@@ -5399,7 +5347,7 @@
         <w:rPr>
           <w:i/>
           <w:iCs/>
-          <w:color w:val="6B7785"/>
+          <w:color w:val="000000"/>
           <w:sz w:val="17"/>
           <w:szCs w:val="17"/>
         </w:rPr>
@@ -5461,7 +5409,7 @@
         <w:rPr>
           <w:i/>
           <w:iCs/>
-          <w:color w:val="6B7785"/>
+          <w:color w:val="000000"/>
           <w:sz w:val="17"/>
           <w:szCs w:val="17"/>
         </w:rPr>
@@ -5516,7 +5464,7 @@
         <w:rPr>
           <w:i/>
           <w:iCs/>
-          <w:color w:val="6B7785"/>
+          <w:color w:val="000000"/>
           <w:sz w:val="17"/>
           <w:szCs w:val="17"/>
         </w:rPr>
@@ -5587,7 +5535,7 @@
         <w:rPr>
           <w:i/>
           <w:iCs/>
-          <w:color w:val="6B7785"/>
+          <w:color w:val="000000"/>
           <w:sz w:val="17"/>
           <w:szCs w:val="17"/>
         </w:rPr>
@@ -5649,7 +5597,7 @@
         <w:rPr>
           <w:i/>
           <w:iCs/>
-          <w:color w:val="6B7785"/>
+          <w:color w:val="000000"/>
           <w:sz w:val="17"/>
           <w:szCs w:val="17"/>
         </w:rPr>
@@ -5667,7 +5615,6 @@
         <w:rPr>
           <w:b/>
           <w:bCs/>
-          <w:color w:val="B5482A"/>
           <w:sz w:val="18"/>
           <w:szCs w:val="18"/>
         </w:rPr>
@@ -5675,7 +5622,7 @@
       </w:r>
       <w:r>
         <w:rPr>
-          <w:color w:val="B5482A"/>
+          <w:color w:val="000000"/>
           <w:sz w:val="18"/>
           <w:szCs w:val="18"/>
         </w:rPr>
@@ -5686,18 +5633,16 @@
       <w:pPr>
         <w:keepNext/>
         <w:keepLines/>
-        <w:shd w:fill="0D2E5C" w:color="auto" w:val="clear"/>
         <w:spacing w:after="60" w:before="160"/>
       </w:pPr>
       <w:r>
         <w:rPr>
           <w:b/>
           <w:bCs/>
-          <w:color w:val="FFFFFF"/>
           <w:sz w:val="22"/>
           <w:szCs w:val="22"/>
         </w:rPr>
-        <w:t xml:space="preserve"> 19 · Discussion</w:t>
+        <w:t xml:space="preserve">19 · Discussion</w:t>
       </w:r>
     </w:p>
     <w:p>
@@ -5779,7 +5724,7 @@
         <w:rPr>
           <w:i/>
           <w:iCs/>
-          <w:color w:val="6B7785"/>
+          <w:color w:val="000000"/>
           <w:sz w:val="17"/>
           <w:szCs w:val="17"/>
         </w:rPr>
@@ -5866,7 +5811,7 @@
         <w:rPr>
           <w:i/>
           <w:iCs/>
-          <w:color w:val="6B7785"/>
+          <w:color w:val="000000"/>
           <w:sz w:val="17"/>
           <w:szCs w:val="17"/>
         </w:rPr>
@@ -5905,7 +5850,7 @@
         <w:rPr>
           <w:i/>
           <w:iCs/>
-          <w:color w:val="6B7785"/>
+          <w:color w:val="000000"/>
           <w:sz w:val="17"/>
           <w:szCs w:val="17"/>
         </w:rPr>
@@ -5960,7 +5905,7 @@
         <w:rPr>
           <w:i/>
           <w:iCs/>
-          <w:color w:val="6B7785"/>
+          <w:color w:val="000000"/>
           <w:sz w:val="17"/>
           <w:szCs w:val="17"/>
         </w:rPr>
@@ -5978,7 +5923,6 @@
         <w:rPr>
           <w:b/>
           <w:bCs/>
-          <w:color w:val="B5482A"/>
           <w:sz w:val="18"/>
           <w:szCs w:val="18"/>
         </w:rPr>
@@ -5986,7 +5930,7 @@
       </w:r>
       <w:r>
         <w:rPr>
-          <w:color w:val="B5482A"/>
+          <w:color w:val="000000"/>
           <w:sz w:val="18"/>
           <w:szCs w:val="18"/>
         </w:rPr>
@@ -5997,18 +5941,16 @@
       <w:pPr>
         <w:keepNext/>
         <w:keepLines/>
-        <w:shd w:fill="0D2E5C" w:color="auto" w:val="clear"/>
         <w:spacing w:after="60" w:before="160"/>
       </w:pPr>
       <w:r>
         <w:rPr>
           <w:b/>
           <w:bCs/>
-          <w:color w:val="FFFFFF"/>
           <w:sz w:val="22"/>
           <w:szCs w:val="22"/>
         </w:rPr>
-        <w:t xml:space="preserve"> 20 · Conclusion</w:t>
+        <w:t xml:space="preserve">20 · Conclusion</w:t>
       </w:r>
     </w:p>
     <w:p>
@@ -6058,7 +6000,7 @@
         <w:rPr>
           <w:i/>
           <w:iCs/>
-          <w:color w:val="6B7785"/>
+          <w:color w:val="000000"/>
           <w:sz w:val="17"/>
           <w:szCs w:val="17"/>
         </w:rPr>
@@ -6129,7 +6071,7 @@
         <w:rPr>
           <w:i/>
           <w:iCs/>
-          <w:color w:val="6B7785"/>
+          <w:color w:val="000000"/>
           <w:sz w:val="17"/>
           <w:szCs w:val="17"/>
         </w:rPr>
@@ -6200,7 +6142,7 @@
         <w:rPr>
           <w:i/>
           <w:iCs/>
-          <w:color w:val="6B7785"/>
+          <w:color w:val="000000"/>
           <w:sz w:val="17"/>
           <w:szCs w:val="17"/>
         </w:rPr>
@@ -6255,7 +6197,7 @@
         <w:rPr>
           <w:i/>
           <w:iCs/>
-          <w:color w:val="6B7785"/>
+          <w:color w:val="000000"/>
           <w:sz w:val="17"/>
           <w:szCs w:val="17"/>
         </w:rPr>
@@ -6310,7 +6252,7 @@
         <w:rPr>
           <w:i/>
           <w:iCs/>
-          <w:color w:val="6B7785"/>
+          <w:color w:val="000000"/>
           <w:sz w:val="17"/>
           <w:szCs w:val="17"/>
         </w:rPr>
@@ -6328,7 +6270,6 @@
         <w:rPr>
           <w:b/>
           <w:bCs/>
-          <w:color w:val="B5482A"/>
           <w:sz w:val="18"/>
           <w:szCs w:val="18"/>
         </w:rPr>
@@ -6336,7 +6277,7 @@
       </w:r>
       <w:r>
         <w:rPr>
-          <w:color w:val="B5482A"/>
+          <w:color w:val="000000"/>
           <w:sz w:val="18"/>
           <w:szCs w:val="18"/>
         </w:rPr>
@@ -6347,18 +6288,16 @@
       <w:pPr>
         <w:keepNext/>
         <w:keepLines/>
-        <w:shd w:fill="0D2E5C" w:color="auto" w:val="clear"/>
         <w:spacing w:after="60" w:before="160"/>
       </w:pPr>
       <w:r>
         <w:rPr>
           <w:b/>
           <w:bCs/>
-          <w:color w:val="FFFFFF"/>
           <w:sz w:val="22"/>
           <w:szCs w:val="22"/>
         </w:rPr>
-        <w:t xml:space="preserve"> 21 · Clinical case</w:t>
+        <w:t xml:space="preserve">21 · Clinical case</w:t>
       </w:r>
     </w:p>
     <w:p>
@@ -6392,7 +6331,7 @@
         <w:rPr>
           <w:i/>
           <w:iCs/>
-          <w:color w:val="6B7785"/>
+          <w:color w:val="000000"/>
           <w:sz w:val="17"/>
           <w:szCs w:val="17"/>
         </w:rPr>
@@ -6447,7 +6386,7 @@
         <w:rPr>
           <w:i/>
           <w:iCs/>
-          <w:color w:val="6B7785"/>
+          <w:color w:val="000000"/>
           <w:sz w:val="17"/>
           <w:szCs w:val="17"/>
         </w:rPr>
@@ -6541,7 +6480,7 @@
         <w:rPr>
           <w:i/>
           <w:iCs/>
-          <w:color w:val="6B7785"/>
+          <w:color w:val="000000"/>
           <w:sz w:val="17"/>
           <w:szCs w:val="17"/>
         </w:rPr>
@@ -6596,7 +6535,7 @@
         <w:rPr>
           <w:i/>
           <w:iCs/>
-          <w:color w:val="6B7785"/>
+          <w:color w:val="000000"/>
           <w:sz w:val="17"/>
           <w:szCs w:val="17"/>
         </w:rPr>
@@ -6674,7 +6613,7 @@
         <w:rPr>
           <w:i/>
           <w:iCs/>
-          <w:color w:val="6B7785"/>
+          <w:color w:val="000000"/>
           <w:sz w:val="17"/>
           <w:szCs w:val="17"/>
         </w:rPr>
@@ -6692,7 +6631,6 @@
         <w:rPr>
           <w:b/>
           <w:bCs/>
-          <w:color w:val="B5482A"/>
           <w:sz w:val="18"/>
           <w:szCs w:val="18"/>
         </w:rPr>
@@ -6700,7 +6638,7 @@
       </w:r>
       <w:r>
         <w:rPr>
-          <w:color w:val="B5482A"/>
+          <w:color w:val="000000"/>
           <w:sz w:val="18"/>
           <w:szCs w:val="18"/>
         </w:rPr>
@@ -6711,18 +6649,16 @@
       <w:pPr>
         <w:keepNext/>
         <w:keepLines/>
-        <w:shd w:fill="0D2E5C" w:color="auto" w:val="clear"/>
         <w:spacing w:after="60" w:before="160"/>
       </w:pPr>
       <w:r>
         <w:rPr>
           <w:b/>
           <w:bCs/>
-          <w:color w:val="FFFFFF"/>
           <w:sz w:val="22"/>
           <w:szCs w:val="22"/>
         </w:rPr>
-        <w:t xml:space="preserve"> 22–24 · References</w:t>
+        <w:t xml:space="preserve">22–24 · References</w:t>
       </w:r>
     </w:p>
     <w:p>
@@ -6756,7 +6692,7 @@
         <w:rPr>
           <w:i/>
           <w:iCs/>
-          <w:color w:val="6B7785"/>
+          <w:color w:val="000000"/>
           <w:sz w:val="17"/>
           <w:szCs w:val="17"/>
         </w:rPr>
@@ -6768,18 +6704,16 @@
       <w:pPr>
         <w:keepNext/>
         <w:keepLines/>
-        <w:shd w:fill="0D2E5C" w:color="auto" w:val="clear"/>
         <w:spacing w:after="60" w:before="160"/>
       </w:pPr>
       <w:r>
         <w:rPr>
           <w:b/>
           <w:bCs/>
-          <w:color w:val="FFFFFF"/>
           <w:sz w:val="22"/>
           <w:szCs w:val="22"/>
         </w:rPr>
-        <w:t xml:space="preserve"> 25 · Questions</w:t>
+        <w:t xml:space="preserve">25 · Questions</w:t>
       </w:r>
     </w:p>
     <w:p>
@@ -6806,7 +6740,7 @@
         <w:rPr>
           <w:i/>
           <w:iCs/>
-          <w:color w:val="6B7785"/>
+          <w:color w:val="000000"/>
           <w:sz w:val="17"/>
           <w:szCs w:val="17"/>
         </w:rPr>
@@ -6874,7 +6808,7 @@
     </w:pPr>
     <w:r>
       <w:rPr>
-        <w:color w:val="6B7785"/>
+        <w:color w:val="000000"/>
         <w:sz w:val="16"/>
         <w:szCs w:val="16"/>
       </w:rPr>
@@ -6882,7 +6816,7 @@
     </w:r>
     <w:r>
       <w:rPr>
-        <w:color w:val="6B7785"/>
+        <w:color w:val="000000"/>
         <w:sz w:val="16"/>
         <w:szCs w:val="16"/>
       </w:rPr>
@@ -7029,7 +6963,7 @@
         <w:ind w:left="360" w:hanging="240"/>
       </w:pPr>
       <w:rPr>
-        <w:color w:val="2B6A99"/>
+        <w:color w:val="000000"/>
       </w:rPr>
     </w:lvl>
   </w:abstractNum>

</xml_diff>